<commit_message>
Knowledge - 6/14/2026 part 2
</commit_message>
<xml_diff>
--- a/Knowledge/3-Work knowledge/1-Software Engineering/2-General Technologies/9-Databases/5-My Source/1-Intro to Databases/1-Data Models/1-Components of a Data Model/1-Entities.docx
+++ b/Knowledge/3-Work knowledge/1-Software Engineering/2-General Technologies/9-Databases/5-My Source/1-Intro to Databases/1-Data Models/1-Components of a Data Model/1-Entities.docx
@@ -7,6 +7,9 @@
         <w:pStyle w:val="Heading1"/>
       </w:pPr>
       <w:r>
+        <w:rPr>
+          <w:rFonts w:ascii="Calibri Light" w:hAnsi="Calibri Light" w:eastAsia="Calibri Light"/>
+        </w:rPr>
         <w:t>Entities</w:t>
       </w:r>
     </w:p>
@@ -16,11 +19,14 @@
       </w:pPr>
       <w:r>
         <w:rPr>
-          <w:rFonts w:ascii="Segoe UI Emoji" w:hAnsi="Segoe UI Emoji" w:cs="Segoe UI Emoji"/>
+          <w:rFonts w:ascii="Calibri Light" w:hAnsi="Calibri Light" w:cs="Segoe UI Emoji" w:eastAsia="Calibri Light"/>
         </w:rPr>
         <w:t>🌟</w:t>
       </w:r>
       <w:r>
+        <w:rPr>
+          <w:rFonts w:ascii="Calibri Light" w:hAnsi="Calibri Light" w:eastAsia="Calibri Light"/>
+        </w:rPr>
         <w:t xml:space="preserve"> Definition</w:t>
       </w:r>
     </w:p>
@@ -163,11 +169,14 @@
       </w:pPr>
       <w:r>
         <w:rPr>
-          <w:rFonts w:ascii="Segoe UI Emoji" w:hAnsi="Segoe UI Emoji" w:cs="Segoe UI Emoji"/>
+          <w:rFonts w:ascii="Calibri Light" w:hAnsi="Calibri Light" w:cs="Segoe UI Emoji" w:eastAsia="Calibri Light"/>
         </w:rPr>
         <w:t>🎯</w:t>
       </w:r>
       <w:r>
+        <w:rPr>
+          <w:rFonts w:ascii="Calibri Light" w:hAnsi="Calibri Light" w:eastAsia="Calibri Light"/>
+        </w:rPr>
         <w:t xml:space="preserve"> Purpose</w:t>
       </w:r>
     </w:p>
@@ -320,11 +329,14 @@
       </w:pPr>
       <w:r>
         <w:rPr>
-          <w:rFonts w:ascii="Segoe UI Emoji" w:hAnsi="Segoe UI Emoji" w:cs="Segoe UI Emoji"/>
+          <w:rFonts w:ascii="Calibri Light" w:hAnsi="Calibri Light" w:cs="Segoe UI Emoji" w:eastAsia="Calibri Light"/>
         </w:rPr>
         <w:t>🧠</w:t>
       </w:r>
       <w:r>
+        <w:rPr>
+          <w:rFonts w:ascii="Calibri Light" w:hAnsi="Calibri Light" w:eastAsia="Calibri Light"/>
+        </w:rPr>
         <w:t xml:space="preserve"> Simple Examples</w:t>
       </w:r>
     </w:p>
@@ -789,11 +801,14 @@
       </w:pPr>
       <w:r>
         <w:rPr>
-          <w:rFonts w:ascii="Segoe UI Emoji" w:hAnsi="Segoe UI Emoji" w:cs="Segoe UI Emoji"/>
+          <w:rFonts w:ascii="Calibri Light" w:hAnsi="Calibri Light" w:cs="Segoe UI Emoji" w:eastAsia="Calibri Light"/>
         </w:rPr>
         <w:t>🔢</w:t>
       </w:r>
       <w:r>
+        <w:rPr>
+          <w:rFonts w:ascii="Calibri Light" w:hAnsi="Calibri Light" w:eastAsia="Calibri Light"/>
+        </w:rPr>
         <w:t xml:space="preserve"> Characteristics of an Entity</w:t>
       </w:r>
     </w:p>
@@ -958,11 +973,14 @@
       </w:pPr>
       <w:r>
         <w:rPr>
-          <w:rFonts w:ascii="Segoe UI Emoji" w:hAnsi="Segoe UI Emoji" w:cs="Segoe UI Emoji"/>
+          <w:rFonts w:ascii="Calibri Light" w:hAnsi="Calibri Light" w:cs="Segoe UI Emoji" w:eastAsia="Calibri Light"/>
         </w:rPr>
         <w:t>📚</w:t>
       </w:r>
       <w:r>
+        <w:rPr>
+          <w:rFonts w:ascii="Calibri Light" w:hAnsi="Calibri Light" w:eastAsia="Calibri Light"/>
+        </w:rPr>
         <w:t xml:space="preserve"> Entity Examples</w:t>
       </w:r>
     </w:p>
@@ -1403,20 +1421,26 @@
       </w:pPr>
       <w:r>
         <w:rPr>
-          <w:rFonts w:ascii="Segoe UI Emoji" w:hAnsi="Segoe UI Emoji" w:cs="Segoe UI Emoji"/>
+          <w:rFonts w:ascii="Calibri Light" w:hAnsi="Calibri Light" w:cs="Segoe UI Emoji" w:eastAsia="Calibri Light"/>
         </w:rPr>
         <w:t>🗄️</w:t>
       </w:r>
       <w:r>
+        <w:rPr>
+          <w:rFonts w:ascii="Calibri Light" w:hAnsi="Calibri Light" w:eastAsia="Calibri Light"/>
+        </w:rPr>
         <w:t xml:space="preserve"> Entity </w:t>
       </w:r>
       <w:r>
         <w:rPr>
-          <w:rFonts w:ascii="Arial" w:hAnsi="Arial" w:cs="Arial"/>
+          <w:rFonts w:ascii="Calibri Light" w:hAnsi="Calibri Light" w:cs="Arial" w:eastAsia="Calibri Light"/>
         </w:rPr>
         <w:t>→</w:t>
       </w:r>
       <w:r>
+        <w:rPr>
+          <w:rFonts w:ascii="Calibri Light" w:hAnsi="Calibri Light" w:eastAsia="Calibri Light"/>
+        </w:rPr>
         <w:t xml:space="preserve"> Database Table</w:t>
       </w:r>
     </w:p>
@@ -1957,11 +1981,14 @@
       </w:pPr>
       <w:r>
         <w:rPr>
-          <w:rFonts w:ascii="Segoe UI Emoji" w:hAnsi="Segoe UI Emoji" w:cs="Segoe UI Emoji"/>
+          <w:rFonts w:ascii="Calibri Light" w:hAnsi="Calibri Light" w:cs="Segoe UI Emoji" w:eastAsia="Calibri Light"/>
         </w:rPr>
         <w:t>🔗</w:t>
       </w:r>
       <w:r>
+        <w:rPr>
+          <w:rFonts w:ascii="Calibri Light" w:hAnsi="Calibri Light" w:eastAsia="Calibri Light"/>
+        </w:rPr>
         <w:t xml:space="preserve"> Entity in an ER Diagram</w:t>
       </w:r>
     </w:p>
@@ -2158,11 +2185,14 @@
       </w:pPr>
       <w:r>
         <w:rPr>
-          <w:rFonts w:ascii="Segoe UI Emoji" w:hAnsi="Segoe UI Emoji" w:cs="Segoe UI Emoji"/>
+          <w:rFonts w:ascii="Calibri Light" w:hAnsi="Calibri Light" w:cs="Segoe UI Emoji" w:eastAsia="Calibri Light"/>
         </w:rPr>
         <w:t>🌍</w:t>
       </w:r>
       <w:r>
+        <w:rPr>
+          <w:rFonts w:ascii="Calibri Light" w:hAnsi="Calibri Light" w:eastAsia="Calibri Light"/>
+        </w:rPr>
         <w:t xml:space="preserve"> Real-World Example</w:t>
       </w:r>
     </w:p>
@@ -2476,11 +2506,14 @@
       </w:pPr>
       <w:r>
         <w:rPr>
-          <w:rFonts w:ascii="Segoe UI Emoji" w:hAnsi="Segoe UI Emoji" w:cs="Segoe UI Emoji"/>
+          <w:rFonts w:ascii="Calibri Light" w:hAnsi="Calibri Light" w:cs="Segoe UI Emoji" w:eastAsia="Calibri Light"/>
         </w:rPr>
         <w:t>⚠️</w:t>
       </w:r>
       <w:r>
+        <w:rPr>
+          <w:rFonts w:ascii="Calibri Light" w:hAnsi="Calibri Light" w:eastAsia="Calibri Light"/>
+        </w:rPr>
         <w:t xml:space="preserve"> Entity vs Attribute</w:t>
       </w:r>
     </w:p>
@@ -2979,11 +3012,14 @@
       </w:pPr>
       <w:r>
         <w:rPr>
-          <w:rFonts w:ascii="Segoe UI Emoji" w:hAnsi="Segoe UI Emoji" w:cs="Segoe UI Emoji"/>
+          <w:rFonts w:ascii="Calibri Light" w:hAnsi="Calibri Light" w:cs="Segoe UI Emoji" w:eastAsia="Calibri Light"/>
         </w:rPr>
         <w:t>🧠</w:t>
       </w:r>
       <w:r>
+        <w:rPr>
+          <w:rFonts w:ascii="Calibri Light" w:hAnsi="Calibri Light" w:eastAsia="Calibri Light"/>
+        </w:rPr>
         <w:t xml:space="preserve"> Simple Analogy</w:t>
       </w:r>
     </w:p>
@@ -3207,11 +3243,14 @@
       </w:pPr>
       <w:r>
         <w:rPr>
-          <w:rFonts w:ascii="Segoe UI Emoji" w:hAnsi="Segoe UI Emoji" w:cs="Segoe UI Emoji"/>
+          <w:rFonts w:ascii="Calibri Light" w:hAnsi="Calibri Light" w:cs="Segoe UI Emoji" w:eastAsia="Calibri Light"/>
         </w:rPr>
         <w:t>🧭</w:t>
       </w:r>
       <w:r>
+        <w:rPr>
+          <w:rFonts w:ascii="Calibri Light" w:hAnsi="Calibri Light" w:eastAsia="Calibri Light"/>
+        </w:rPr>
         <w:t xml:space="preserve"> Summary</w:t>
       </w:r>
     </w:p>

</xml_diff>